<commit_message>
fix(master-wrapup): remove dead lever linear slug, fix adzuna query syntax, sanitize paths, and sync full module tree
</commit_message>
<xml_diff>
--- a/KU_/Job_Digest_Master_Architecture_Report.docx
+++ b/KU_/Job_Digest_Master_Architecture_Report.docx
@@ -2195,7 +2195,7 @@
           <w:color w:val="0F172A"/>
           <w:sz w:val="28"/>
         </w:rPr>
-        <w:t>3. All Ingestion Websites &amp; API Endpoints (10 Sources • 57 Company Boards)</w:t>
+        <w:t>3. All Ingestion Websites &amp; API Endpoints (10 Sources • 56 Company Boards)</w:t>
       </w:r>
     </w:p>
     <w:tbl>
@@ -2516,7 +2516,7 @@
                 <w:color w:val="334155"/>
                 <w:sz w:val="18"/>
               </w:rPr>
-              <w:t>10 Boards: CRED, Meesho, Palantir, Spotify, Lever, Canonical, Postman, Linear, Docker, BrowserStack</w:t>
+              <w:t>9 Boards: CRED, Meesho, Palantir, Spotify, Lever, Canonical, Postman, Docker, BrowserStack (Linear on Ashby)</w:t>
             </w:r>
           </w:p>
         </w:tc>
@@ -2822,7 +2822,7 @@
                 <w:color w:val="334155"/>
                 <w:sz w:val="18"/>
               </w:rPr>
-              <w:t>4 Boards: Transferwise, Harness, TestGorilla, Farfetch</w:t>
+              <w:t>4 Boards: Transferwise, Harness, TestGorilla, Farfetch (International listings)</w:t>
             </w:r>
           </w:p>
         </w:tc>
@@ -3230,7 +3230,7 @@
                 <w:color w:val="334155"/>
                 <w:sz w:val="18"/>
               </w:rPr>
-              <w:t>6 Targeted Boolean query groups across Indian tech hubs</w:t>
+              <w:t>6 Clean keyword query groups across Indian tech hubs (Python, Backend, Trainee, Intern)</w:t>
             </w:r>
           </w:p>
         </w:tc>
@@ -3775,7 +3775,7 @@
                 <w:color w:val="334155"/>
                 <w:sz w:val="18"/>
               </w:rPr>
-              <w:t>job_digest/urgency.py</w:t>
+              <w:t>job_digest/normalize.py</w:t>
             </w:r>
           </w:p>
         </w:tc>
@@ -3800,6 +3800,83 @@
                 <w:color w:val="334155"/>
                 <w:sz w:val="18"/>
               </w:rPr>
+              <w:t>Normalization Engine</w:t>
+            </w:r>
+          </w:p>
+        </w:tc>
+        <w:tc>
+          <w:tcPr>
+            <w:tcW w:type="dxa" w:w="4608"/>
+            <w:shd w:val="clear" w:color="auto" w:fill="FFFFFF"/>
+            <w:tcMar>
+              <w:top w:w="80" w:type="dxa"/>
+              <w:bottom w:w="80" w:type="dxa"/>
+              <w:left w:w="120" w:type="dxa"/>
+              <w:right w:w="120" w:type="dxa"/>
+            </w:tcMar>
+          </w:tcPr>
+          <w:p>
+            <w:pPr>
+              <w:jc w:val="left"/>
+            </w:pPr>
+            <w:r>
+              <w:rPr>
+                <w:rFonts w:ascii="Calibri" w:hAnsi="Calibri"/>
+                <w:color w:val="334155"/>
+                <w:sz w:val="18"/>
+              </w:rPr>
+              <w:t>HTML stripping, location canonicalization, regex word boundaries, salary parsing</w:t>
+            </w:r>
+          </w:p>
+        </w:tc>
+      </w:tr>
+      <w:tr>
+        <w:tc>
+          <w:tcPr>
+            <w:tcW w:type="dxa" w:w="2592"/>
+            <w:shd w:val="clear" w:color="auto" w:fill="F8FAFC"/>
+            <w:tcMar>
+              <w:top w:w="80" w:type="dxa"/>
+              <w:bottom w:w="80" w:type="dxa"/>
+              <w:left w:w="120" w:type="dxa"/>
+              <w:right w:w="120" w:type="dxa"/>
+            </w:tcMar>
+          </w:tcPr>
+          <w:p>
+            <w:pPr>
+              <w:jc w:val="left"/>
+            </w:pPr>
+            <w:r>
+              <w:rPr>
+                <w:rFonts w:ascii="Calibri" w:hAnsi="Calibri"/>
+                <w:color w:val="334155"/>
+                <w:sz w:val="18"/>
+              </w:rPr>
+              <w:t>job_digest/urgency.py</w:t>
+            </w:r>
+          </w:p>
+        </w:tc>
+        <w:tc>
+          <w:tcPr>
+            <w:tcW w:type="dxa" w:w="2160"/>
+            <w:shd w:val="clear" w:color="auto" w:fill="F8FAFC"/>
+            <w:tcMar>
+              <w:top w:w="80" w:type="dxa"/>
+              <w:bottom w:w="80" w:type="dxa"/>
+              <w:left w:w="120" w:type="dxa"/>
+              <w:right w:w="120" w:type="dxa"/>
+            </w:tcMar>
+          </w:tcPr>
+          <w:p>
+            <w:pPr>
+              <w:jc w:val="left"/>
+            </w:pPr>
+            <w:r>
+              <w:rPr>
+                <w:rFonts w:ascii="Calibri" w:hAnsi="Calibri"/>
+                <w:color w:val="334155"/>
+                <w:sz w:val="18"/>
+              </w:rPr>
               <w:t>Urgency Detector</w:t>
             </w:r>
           </w:p>
@@ -3807,7 +3884,7 @@
         <w:tc>
           <w:tcPr>
             <w:tcW w:type="dxa" w:w="4608"/>
-            <w:shd w:val="clear" w:color="auto" w:fill="FFFFFF"/>
+            <w:shd w:val="clear" w:color="auto" w:fill="F8FAFC"/>
             <w:tcMar>
               <w:top w:w="80" w:type="dxa"/>
               <w:bottom w:w="80" w:type="dxa"/>
@@ -3834,7 +3911,7 @@
         <w:tc>
           <w:tcPr>
             <w:tcW w:type="dxa" w:w="2592"/>
-            <w:shd w:val="clear" w:color="auto" w:fill="F8FAFC"/>
+            <w:shd w:val="clear" w:color="auto" w:fill="FFFFFF"/>
             <w:tcMar>
               <w:top w:w="80" w:type="dxa"/>
               <w:bottom w:w="80" w:type="dxa"/>
@@ -3859,7 +3936,7 @@
         <w:tc>
           <w:tcPr>
             <w:tcW w:type="dxa" w:w="2160"/>
-            <w:shd w:val="clear" w:color="auto" w:fill="F8FAFC"/>
+            <w:shd w:val="clear" w:color="auto" w:fill="FFFFFF"/>
             <w:tcMar>
               <w:top w:w="80" w:type="dxa"/>
               <w:bottom w:w="80" w:type="dxa"/>
@@ -3884,7 +3961,7 @@
         <w:tc>
           <w:tcPr>
             <w:tcW w:type="dxa" w:w="4608"/>
-            <w:shd w:val="clear" w:color="auto" w:fill="F8FAFC"/>
+            <w:shd w:val="clear" w:color="auto" w:fill="FFFFFF"/>
             <w:tcMar>
               <w:top w:w="80" w:type="dxa"/>
               <w:bottom w:w="80" w:type="dxa"/>
@@ -3911,7 +3988,7 @@
         <w:tc>
           <w:tcPr>
             <w:tcW w:type="dxa" w:w="2592"/>
-            <w:shd w:val="clear" w:color="auto" w:fill="FFFFFF"/>
+            <w:shd w:val="clear" w:color="auto" w:fill="F8FAFC"/>
             <w:tcMar>
               <w:top w:w="80" w:type="dxa"/>
               <w:bottom w:w="80" w:type="dxa"/>
@@ -3936,7 +4013,7 @@
         <w:tc>
           <w:tcPr>
             <w:tcW w:type="dxa" w:w="2160"/>
-            <w:shd w:val="clear" w:color="auto" w:fill="FFFFFF"/>
+            <w:shd w:val="clear" w:color="auto" w:fill="F8FAFC"/>
             <w:tcMar>
               <w:top w:w="80" w:type="dxa"/>
               <w:bottom w:w="80" w:type="dxa"/>
@@ -3961,7 +4038,7 @@
         <w:tc>
           <w:tcPr>
             <w:tcW w:type="dxa" w:w="4608"/>
-            <w:shd w:val="clear" w:color="auto" w:fill="FFFFFF"/>
+            <w:shd w:val="clear" w:color="auto" w:fill="F8FAFC"/>
             <w:tcMar>
               <w:top w:w="80" w:type="dxa"/>
               <w:bottom w:w="80" w:type="dxa"/>
@@ -3988,7 +4065,7 @@
         <w:tc>
           <w:tcPr>
             <w:tcW w:type="dxa" w:w="2592"/>
-            <w:shd w:val="clear" w:color="auto" w:fill="F8FAFC"/>
+            <w:shd w:val="clear" w:color="auto" w:fill="FFFFFF"/>
             <w:tcMar>
               <w:top w:w="80" w:type="dxa"/>
               <w:bottom w:w="80" w:type="dxa"/>
@@ -4013,7 +4090,7 @@
         <w:tc>
           <w:tcPr>
             <w:tcW w:type="dxa" w:w="2160"/>
-            <w:shd w:val="clear" w:color="auto" w:fill="F8FAFC"/>
+            <w:shd w:val="clear" w:color="auto" w:fill="FFFFFF"/>
             <w:tcMar>
               <w:top w:w="80" w:type="dxa"/>
               <w:bottom w:w="80" w:type="dxa"/>
@@ -4038,7 +4115,7 @@
         <w:tc>
           <w:tcPr>
             <w:tcW w:type="dxa" w:w="4608"/>
-            <w:shd w:val="clear" w:color="auto" w:fill="F8FAFC"/>
+            <w:shd w:val="clear" w:color="auto" w:fill="FFFFFF"/>
             <w:tcMar>
               <w:top w:w="80" w:type="dxa"/>
               <w:bottom w:w="80" w:type="dxa"/>
@@ -4065,7 +4142,7 @@
         <w:tc>
           <w:tcPr>
             <w:tcW w:type="dxa" w:w="2592"/>
-            <w:shd w:val="clear" w:color="auto" w:fill="FFFFFF"/>
+            <w:shd w:val="clear" w:color="auto" w:fill="F8FAFC"/>
             <w:tcMar>
               <w:top w:w="80" w:type="dxa"/>
               <w:bottom w:w="80" w:type="dxa"/>
@@ -4090,7 +4167,7 @@
         <w:tc>
           <w:tcPr>
             <w:tcW w:type="dxa" w:w="2160"/>
-            <w:shd w:val="clear" w:color="auto" w:fill="FFFFFF"/>
+            <w:shd w:val="clear" w:color="auto" w:fill="F8FAFC"/>
             <w:tcMar>
               <w:top w:w="80" w:type="dxa"/>
               <w:bottom w:w="80" w:type="dxa"/>
@@ -4115,7 +4192,7 @@
         <w:tc>
           <w:tcPr>
             <w:tcW w:type="dxa" w:w="4608"/>
-            <w:shd w:val="clear" w:color="auto" w:fill="FFFFFF"/>
+            <w:shd w:val="clear" w:color="auto" w:fill="F8FAFC"/>
             <w:tcMar>
               <w:top w:w="80" w:type="dxa"/>
               <w:bottom w:w="80" w:type="dxa"/>
@@ -4142,7 +4219,7 @@
         <w:tc>
           <w:tcPr>
             <w:tcW w:type="dxa" w:w="2592"/>
-            <w:shd w:val="clear" w:color="auto" w:fill="F8FAFC"/>
+            <w:shd w:val="clear" w:color="auto" w:fill="FFFFFF"/>
             <w:tcMar>
               <w:top w:w="80" w:type="dxa"/>
               <w:bottom w:w="80" w:type="dxa"/>
@@ -4167,7 +4244,7 @@
         <w:tc>
           <w:tcPr>
             <w:tcW w:type="dxa" w:w="2160"/>
-            <w:shd w:val="clear" w:color="auto" w:fill="F8FAFC"/>
+            <w:shd w:val="clear" w:color="auto" w:fill="FFFFFF"/>
             <w:tcMar>
               <w:top w:w="80" w:type="dxa"/>
               <w:bottom w:w="80" w:type="dxa"/>
@@ -4192,6 +4269,33 @@
         <w:tc>
           <w:tcPr>
             <w:tcW w:type="dxa" w:w="4608"/>
+            <w:shd w:val="clear" w:color="auto" w:fill="FFFFFF"/>
+            <w:tcMar>
+              <w:top w:w="80" w:type="dxa"/>
+              <w:bottom w:w="80" w:type="dxa"/>
+              <w:left w:w="120" w:type="dxa"/>
+              <w:right w:w="120" w:type="dxa"/>
+            </w:tcMar>
+          </w:tcPr>
+          <w:p>
+            <w:pPr>
+              <w:jc w:val="left"/>
+            </w:pPr>
+            <w:r>
+              <w:rPr>
+                <w:rFonts w:ascii="Calibri" w:hAnsi="Calibri"/>
+                <w:color w:val="334155"/>
+                <w:sz w:val="18"/>
+              </w:rPr>
+              <w:t>56 verified company boards for Greenhouse (26), Lever (9), Ashby (9), SmartRecruiters (8), Workable (4)</w:t>
+            </w:r>
+          </w:p>
+        </w:tc>
+      </w:tr>
+      <w:tr>
+        <w:tc>
+          <w:tcPr>
+            <w:tcW w:type="dxa" w:w="2592"/>
             <w:shd w:val="clear" w:color="auto" w:fill="F8FAFC"/>
             <w:tcMar>
               <w:top w:w="80" w:type="dxa"/>
@@ -4210,7 +4314,57 @@
                 <w:color w:val="334155"/>
                 <w:sz w:val="18"/>
               </w:rPr>
-              <w:t>57 verified company boards for Greenhouse, Lever, Ashby, SmartRecruiters, and Workable</w:t>
+              <w:t>profile.example.yaml</w:t>
+            </w:r>
+          </w:p>
+        </w:tc>
+        <w:tc>
+          <w:tcPr>
+            <w:tcW w:type="dxa" w:w="2160"/>
+            <w:shd w:val="clear" w:color="auto" w:fill="F8FAFC"/>
+            <w:tcMar>
+              <w:top w:w="80" w:type="dxa"/>
+              <w:bottom w:w="80" w:type="dxa"/>
+              <w:left w:w="120" w:type="dxa"/>
+              <w:right w:w="120" w:type="dxa"/>
+            </w:tcMar>
+          </w:tcPr>
+          <w:p>
+            <w:pPr>
+              <w:jc w:val="left"/>
+            </w:pPr>
+            <w:r>
+              <w:rPr>
+                <w:rFonts w:ascii="Calibri" w:hAnsi="Calibri"/>
+                <w:color w:val="334155"/>
+                <w:sz w:val="18"/>
+              </w:rPr>
+              <w:t>Candidate Profile Template</w:t>
+            </w:r>
+          </w:p>
+        </w:tc>
+        <w:tc>
+          <w:tcPr>
+            <w:tcW w:type="dxa" w:w="4608"/>
+            <w:shd w:val="clear" w:color="auto" w:fill="F8FAFC"/>
+            <w:tcMar>
+              <w:top w:w="80" w:type="dxa"/>
+              <w:bottom w:w="80" w:type="dxa"/>
+              <w:left w:w="120" w:type="dxa"/>
+              <w:right w:w="120" w:type="dxa"/>
+            </w:tcMar>
+          </w:tcPr>
+          <w:p>
+            <w:pPr>
+              <w:jc w:val="left"/>
+            </w:pPr>
+            <w:r>
+              <w:rPr>
+                <w:rFonts w:ascii="Calibri" w:hAnsi="Calibri"/>
+                <w:color w:val="334155"/>
+                <w:sz w:val="18"/>
+              </w:rPr>
+              <w:t>Tracked profile configuration template (private profile.yaml is local &amp; git-ignored)</w:t>
             </w:r>
           </w:p>
         </w:tc>
@@ -4237,7 +4391,7 @@
                 <w:color w:val="334155"/>
                 <w:sz w:val="18"/>
               </w:rPr>
-              <w:t>profile.yaml</w:t>
+              <w:t>scripts/check_ats_slugs.py</w:t>
             </w:r>
           </w:p>
         </w:tc>
@@ -4262,7 +4416,7 @@
                 <w:color w:val="334155"/>
                 <w:sz w:val="18"/>
               </w:rPr>
-              <w:t>Candidate Profile</w:t>
+              <w:t>CLI Scanner</w:t>
             </w:r>
           </w:p>
         </w:tc>
@@ -4287,7 +4441,7 @@
                 <w:color w:val="334155"/>
                 <w:sz w:val="18"/>
               </w:rPr>
-              <w:t>Defines target roles, skills, locations, and scoring thresholds</w:t>
+              <w:t>Automated validation tool for testing new company ATS career slugs</w:t>
             </w:r>
           </w:p>
         </w:tc>
@@ -4314,7 +4468,7 @@
                 <w:color w:val="334155"/>
                 <w:sz w:val="18"/>
               </w:rPr>
-              <w:t>scripts/check_ats_slugs.py</w:t>
+              <w:t>site/build.py</w:t>
             </w:r>
           </w:p>
         </w:tc>
@@ -4339,7 +4493,7 @@
                 <w:color w:val="334155"/>
                 <w:sz w:val="18"/>
               </w:rPr>
-              <w:t>CLI Scanner</w:t>
+              <w:t>Showcase Generator</w:t>
             </w:r>
           </w:p>
         </w:tc>
@@ -4364,7 +4518,7 @@
                 <w:color w:val="334155"/>
                 <w:sz w:val="18"/>
               </w:rPr>
-              <w:t>Automated validation tool for testing new company ATS career slugs</w:t>
+              <w:t>Generates static HTML with Schema.org JSON-LD for GitHub Pages</w:t>
             </w:r>
           </w:p>
         </w:tc>
@@ -4391,7 +4545,7 @@
                 <w:color w:val="334155"/>
                 <w:sz w:val="18"/>
               </w:rPr>
-              <w:t>site/build.py</w:t>
+              <w:t>tests/test_*.py (21 files)</w:t>
             </w:r>
           </w:p>
         </w:tc>
@@ -4416,7 +4570,7 @@
                 <w:color w:val="334155"/>
                 <w:sz w:val="18"/>
               </w:rPr>
-              <w:t>Showcase Generator</w:t>
+              <w:t>Automated Tests</w:t>
             </w:r>
           </w:p>
         </w:tc>
@@ -4424,83 +4578,6 @@
           <w:tcPr>
             <w:tcW w:type="dxa" w:w="4608"/>
             <w:shd w:val="clear" w:color="auto" w:fill="FFFFFF"/>
-            <w:tcMar>
-              <w:top w:w="80" w:type="dxa"/>
-              <w:bottom w:w="80" w:type="dxa"/>
-              <w:left w:w="120" w:type="dxa"/>
-              <w:right w:w="120" w:type="dxa"/>
-            </w:tcMar>
-          </w:tcPr>
-          <w:p>
-            <w:pPr>
-              <w:jc w:val="left"/>
-            </w:pPr>
-            <w:r>
-              <w:rPr>
-                <w:rFonts w:ascii="Calibri" w:hAnsi="Calibri"/>
-                <w:color w:val="334155"/>
-                <w:sz w:val="18"/>
-              </w:rPr>
-              <w:t>Generates static HTML with Schema.org JSON-LD for GitHub Pages</w:t>
-            </w:r>
-          </w:p>
-        </w:tc>
-      </w:tr>
-      <w:tr>
-        <w:tc>
-          <w:tcPr>
-            <w:tcW w:type="dxa" w:w="2592"/>
-            <w:shd w:val="clear" w:color="auto" w:fill="F8FAFC"/>
-            <w:tcMar>
-              <w:top w:w="80" w:type="dxa"/>
-              <w:bottom w:w="80" w:type="dxa"/>
-              <w:left w:w="120" w:type="dxa"/>
-              <w:right w:w="120" w:type="dxa"/>
-            </w:tcMar>
-          </w:tcPr>
-          <w:p>
-            <w:pPr>
-              <w:jc w:val="left"/>
-            </w:pPr>
-            <w:r>
-              <w:rPr>
-                <w:rFonts w:ascii="Calibri" w:hAnsi="Calibri"/>
-                <w:color w:val="334155"/>
-                <w:sz w:val="18"/>
-              </w:rPr>
-              <w:t>tests/test_*.py (20 files)</w:t>
-            </w:r>
-          </w:p>
-        </w:tc>
-        <w:tc>
-          <w:tcPr>
-            <w:tcW w:type="dxa" w:w="2160"/>
-            <w:shd w:val="clear" w:color="auto" w:fill="F8FAFC"/>
-            <w:tcMar>
-              <w:top w:w="80" w:type="dxa"/>
-              <w:bottom w:w="80" w:type="dxa"/>
-              <w:left w:w="120" w:type="dxa"/>
-              <w:right w:w="120" w:type="dxa"/>
-            </w:tcMar>
-          </w:tcPr>
-          <w:p>
-            <w:pPr>
-              <w:jc w:val="left"/>
-            </w:pPr>
-            <w:r>
-              <w:rPr>
-                <w:rFonts w:ascii="Calibri" w:hAnsi="Calibri"/>
-                <w:color w:val="334155"/>
-                <w:sz w:val="18"/>
-              </w:rPr>
-              <w:t>Automated Tests</w:t>
-            </w:r>
-          </w:p>
-        </w:tc>
-        <w:tc>
-          <w:tcPr>
-            <w:tcW w:type="dxa" w:w="4608"/>
-            <w:shd w:val="clear" w:color="auto" w:fill="F8FAFC"/>
             <w:tcMar>
               <w:top w:w="80" w:type="dxa"/>
               <w:bottom w:w="80" w:type="dxa"/>

</xml_diff>